<commit_message>
Revise paper prose to remove AI-idiom phrasing and stylistic em dashes
- Rewrite two 'not X but Y' constructions in the abstract and UI section
- Replace two parenthetical em-dash asides with plain punctuation
- Abstract-- and Index Terms-- em dashes kept (mandated IEEE template style)

Co-Authored-By: Claude Sonnet 5 <noreply@anthropic.com>
</commit_message>
<xml_diff>
--- a/paper/paper_final.docx
+++ b/paper/paper_final.docx
@@ -163,7 +163,7 @@
         <w:rPr>
           <w:b/>
         </w:rPr>
-        <w:t>Search in conventional electronic health record (EHR) systems is typically limited to exact keyword matching, which fails to handle synonyms, abbreviations, and terminology variation in free-text clinical notes. This project implements a ranked retrieval engine based on BM25 and integrates it into the open-source OpenMRS platform as an add-on module. Its main contribution is not merely applying BM25, but an ablation study of a clinical normalization and expansion layer: a negation-preserving stopword list, multiword-term detection, and medical abbreviation/synonym expansion. The system is evaluated on the MTSamples dataset, processed into 2,316 final documents, comparing five retrieval variants (V0–V4) side by side. Results show that clinical normalization (V1) is marginally above the naive baseline (V0) on nDCG@10 (0.6865 vs. 0.6832), but the gap is equivalent to only one document moving into the top ten and has not been tested for statistical significance; we therefore report this finding as “does not degrade ranking quality” rather than as a confirmed improvement. The precision drop observed in the expansion variants is reported as-is, together with an analysis of qrels limitations that explains most of the decrease. The resulting module was verified to run on OpenMRS 2.8.8 with a shaded Apache Lucene 8.11.2 index to avoid dependency conflicts.</w:t>
+        <w:t>Search in conventional electronic health record (EHR) systems is typically limited to exact keyword matching, which fails to handle synonyms, abbreviations, and terminology variation in free-text clinical notes. This project implements a ranked retrieval engine based on BM25 and integrates it into the open-source OpenMRS platform as an add-on module. Rather than treating BM25 as a finished baseline, the project runs it through an ablation study of a clinical normalization and expansion layer: a negation-preserving stopword list, multiword-term detection, and medical abbreviation/synonym expansion. The system is evaluated on the MTSamples dataset, processed into 2,316 final documents, comparing five retrieval variants (V0–V4) side by side. Results show that clinical normalization (V1) is marginally above the naive baseline (V0) on nDCG@10 (0.6865 vs. 0.6832), but the gap is equivalent to only one document moving into the top ten and has not been tested for statistical significance; we therefore report this finding as “does not degrade ranking quality” rather than as a confirmed improvement. The precision drop observed in the expansion variants is reported as-is, together with an analysis of qrels limitations that explains most of the decrease. The resulting module was verified to run on OpenMRS 2.8.8 with a shaded Apache Lucene 8.11.2 index to avoid dependency conflicts.</w:t>
       </w:r>
     </w:p>
     <w:p>
@@ -1753,7 +1753,7 @@
         <w:pStyle w:val="Text"/>
       </w:pPr>
       <w:r>
-        <w:t>The module is packaged as an .omod file and exposes the endpoint GET /module/ir-bm25/search.json?q={keyword}&amp;variant={v0..v4}&amp;limit={k}, which returns ranked documents with score and snippet. The user interface provides a dropdown to select a variant, as well as a “compare all” mode that displays all five variants side by side. This dropdown is not mere navigation but an interactive ablation-study tool: users (or evaluators) can directly observe differences in search results across tokenization layers for the same query, without re-running the evaluation pipeline separately. A navigation link was added to the Legacy UI sidebar via the org.openmrs.gutter.tools extension. Fig. 2 shows the single-variant search interface.</w:t>
+        <w:t>The module is packaged as an .omod file and exposes the endpoint GET /module/ir-bm25/search.json?q={keyword}&amp;variant={v0..v4}&amp;limit={k}, which returns ranked documents with score and snippet. The user interface provides a dropdown to select a variant, as well as a “compare all” mode that displays all five variants side by side. The dropdown doubles as an interactive ablation-study tool: users (or evaluators) can directly observe differences in search results across tokenization layers for the same query, without re-running the evaluation pipeline separately. A navigation link was added to the Legacy UI sidebar via the org.openmrs.gutter.tools extension. Fig. 2 shows the single-variant search interface.</w:t>
       </w:r>
     </w:p>
     <w:p>
@@ -2581,7 +2581,7 @@
         <w:pStyle w:val="Text"/>
       </w:pPr>
       <w:r>
-        <w:t>As a result, a document whose transcription genuinely discusses a clinical condition but whose metadata does not contain the matching term will be judged not relevant, even though the document is in fact relevant and was successfully retrieved by the system. This bias falls hardest precisely on the variants designed to look beneath the surface of the text — V2 (synonym expansion), V3 (character n-gram), and V4 (PRF) — because the additional documents they retrieve tend to be matches within the narrative body rather than the metadata. In other words, part of what is measured as a precision drop in Table V is potentially a protocol artifact rather than a genuine failure of those variants.</w:t>
+        <w:t>As a result, a document whose transcription genuinely discusses a clinical condition but whose metadata does not contain the matching term will be judged not relevant, even though the document is in fact relevant and was successfully retrieved by the system. This bias falls hardest on the variants designed to look beneath the surface of the text, namely V2 (synonym expansion), V3 (character n-gram), and V4 (PRF), because the additional documents they retrieve tend to be matches within the narrative body rather than the metadata. In other words, part of what is measured as a precision drop in Table V is potentially a protocol artifact rather than a genuine failure of those variants.</w:t>
       </w:r>
     </w:p>
     <w:p>
@@ -2629,7 +2629,7 @@
         <w:pStyle w:val="Text"/>
       </w:pPr>
       <w:r>
-        <w:t>Future development is directed at four items. First, constructing relevance judgments assessed directly on transcription content, ideally through manual annotation by clinically trained staff, so that expansion variants are judged in the same domain as the indexing domain. Second, adding per-query score output to EvalRunner so that statistical significance tests (a paired t-test or a randomization test) can be run, giving cross-variant comparisons an inferential basis. Third, extending the clinical lexicon from a manually curated dictionary toward standardized sources such as UMLS [16] or SNOMED CT, so that abbreviation coverage — currently only 28.8% — can be increased. Fourth, tuning the k1 and b parameters per variant and evaluating at larger cutoffs K so that Recall@K is not constrained by the low ceiling caused by the large number of relevant documents per query.</w:t>
+        <w:t>Future development is directed at four items. First, constructing relevance judgments assessed directly on transcription content, ideally through manual annotation by clinically trained staff, so that expansion variants are judged in the same domain as the indexing domain. Second, adding per-query score output to EvalRunner so that statistical significance tests (a paired t-test or a randomization test) can be run, giving cross-variant comparisons an inferential basis. Third, extending the clinical lexicon from a manually curated dictionary toward standardized sources such as UMLS [16] or SNOMED CT, so that abbreviation coverage, currently only 28.8%, can be increased. Fourth, tuning the k1 and b parameters per variant and evaluating at larger cutoffs K so that Recall@K is not constrained by the low ceiling caused by the large number of relevant documents per query.</w:t>
       </w:r>
     </w:p>
     <w:p>

</xml_diff>